<commit_message>
Memoria Act3: coautores, sin figuras y ajuste a 10 páginas
- Portada: añadidos los 5 coautores del Grupo 22.
- Eliminadas las 2 figuras pendientes (montaje Wokwi y diagrama de
  bloques) y sus referencias; memoria sin imágenes.
- Corregido fallo de compilación (\% en modo matemático con babel-es).
- Compactado a 10 páginas (margen 1,8 cm, parskip 4pt) manteniendo
  Calibri 12 e interlineado 1,5.
- Regenerado memoria.docx; limpiado código muerto en _preprocesar.py.
</commit_message>
<xml_diff>
--- a/memoria_docx/memoria.docx
+++ b/memoria_docx/memoria.docx
@@ -81,7 +81,7 @@
           <w:bCs/>
           <w:b/>
         </w:rPr>
-        <w:t xml:space="preserve">Autor:</w:t>
+        <w:t xml:space="preserve">Autores:</w:t>
       </w:r>
       <w:r>
         <w:br/>
@@ -92,7 +92,39 @@
         <w:pStyle w:val="BodyText"/>
       </w:pPr>
       <w:r>
+        <w:t xml:space="preserve">Miguel Fernández-Reyes Falcón</w:t>
+      </w:r>
+    </w:p>
+    <w:p>
+      <w:pPr>
+        <w:pStyle w:val="BodyText"/>
+      </w:pPr>
+      <w:r>
+        <w:t xml:space="preserve">Daniel Alessandro Guarino Sosa</w:t>
+      </w:r>
+    </w:p>
+    <w:p>
+      <w:pPr>
+        <w:pStyle w:val="BodyText"/>
+      </w:pPr>
+      <w:r>
         <w:t xml:space="preserve">Stefan Lica Cristian Ionita</w:t>
+      </w:r>
+    </w:p>
+    <w:p>
+      <w:pPr>
+        <w:pStyle w:val="BodyText"/>
+      </w:pPr>
+      <w:r>
+        <w:t xml:space="preserve">Julia Martín Fuente</w:t>
+      </w:r>
+    </w:p>
+    <w:p>
+      <w:pPr>
+        <w:pStyle w:val="BodyText"/>
+      </w:pPr>
+      <w:r>
+        <w:t xml:space="preserve">Miguel Mendoza Larrañaga</w:t>
       </w:r>
     </w:p>
     <w:p>
@@ -738,20 +770,6 @@
         </w:rPr>
         <w:t xml:space="preserve">diagram.json</w:t>
       </w:r>
-      <w:r>
-        <w:t xml:space="preserve"> </w:t>
-      </w:r>
-      <w:r>
-        <w:t xml:space="preserve">y se reproduce en la figura </w:t>
-      </w:r>
-      <w:hyperlink w:anchor="fig:wokwi">
-        <w:r>
-          <w:rPr>
-            <w:rStyle w:val="Hyperlink"/>
-          </w:rPr>
-          <w:t xml:space="preserve">1</w:t>
-        </w:r>
-      </w:hyperlink>
       <w:r>
         <w:t xml:space="preserve">.</w:t>
       </w:r>
@@ -1557,42 +1575,6 @@
       </w:tr>
     </w:tbl>
     <w:bookmarkEnd w:id="21"/>
-    <w:tbl>
-      <w:tblPr>
-        <w:tblStyle w:val="FigureTable"/>
-        <w:tblW w:type="auto" w:w="0"/>
-        <w:tblLook w:firstRow="0" w:lastRow="0" w:firstColumn="0" w:lastColumn="0"/>
-        <w:jc w:val="center"/>
-      </w:tblPr>
-      <w:tblGrid>
-        <w:gridCol w:w="7920"/>
-      </w:tblGrid>
-      <w:tr>
-        <w:tc>
-          <w:tcPr/>
-          <w:p>
-            <w:pPr>
-              <w:pStyle w:val="Compact"/>
-              <w:jc w:val="center"/>
-            </w:pPr>
-          </w:p>
-        </w:tc>
-      </w:tr>
-    </w:tbl>
-    <w:p>
-      <w:pPr>
-        <w:pStyle w:val="ImageCaption"/>
-      </w:pPr>
-      <w:r>
-        <w:t xml:space="preserve">Montaje completo en Wokwi: clasificador, ascensor, HMI y la pareja</w:t>
-      </w:r>
-      <w:r>
-        <w:t xml:space="preserve"> </w:t>
-      </w:r>
-      <w:r>
-        <w:t xml:space="preserve">de sensores nuevos del autodiagnóstico (DHT22 de reserva y potenciómetro).</w:t>
-      </w:r>
-    </w:p>
     <w:bookmarkStart w:id="24" w:name="pines-nuevos-del-autodiagnóstico"/>
     <w:p>
       <w:pPr>
@@ -2903,78 +2885,7 @@
         <w:t xml:space="preserve"> </w:t>
       </w:r>
       <w:r>
-        <w:t xml:space="preserve">con una severidad escalonada que puede llegar a inhibir el ascensor. El</w:t>
-      </w:r>
-      <w:r>
-        <w:t xml:space="preserve"> </w:t>
-      </w:r>
-      <w:r>
-        <w:t xml:space="preserve">diagrama de bloques se muestra en la figura </w:t>
-      </w:r>
-      <w:hyperlink w:anchor="fig:diag">
-        <w:r>
-          <w:rPr>
-            <w:rStyle w:val="Hyperlink"/>
-          </w:rPr>
-          <w:t xml:space="preserve">2</w:t>
-        </w:r>
-      </w:hyperlink>
-      <w:r>
-        <w:t xml:space="preserve">.</w:t>
-      </w:r>
-    </w:p>
-    <w:tbl>
-      <w:tblPr>
-        <w:tblStyle w:val="FigureTable"/>
-        <w:tblW w:type="auto" w:w="0"/>
-        <w:tblLook w:firstRow="0" w:lastRow="0" w:firstColumn="0" w:lastColumn="0"/>
-        <w:jc w:val="center"/>
-      </w:tblPr>
-      <w:tblGrid>
-        <w:gridCol w:w="7920"/>
-      </w:tblGrid>
-      <w:tr>
-        <w:tc>
-          <w:tcPr/>
-          <w:p>
-            <w:pPr>
-              <w:pStyle w:val="Compact"/>
-              <w:jc w:val="center"/>
-            </w:pPr>
-          </w:p>
-        </w:tc>
-      </w:tr>
-    </w:tbl>
-    <w:p>
-      <w:pPr>
-        <w:pStyle w:val="ImageCaption"/>
-      </w:pPr>
-      <w:r>
-        <w:t xml:space="preserve">Tubería de</w:t>
-      </w:r>
-      <w:r>
-        <w:t xml:space="preserve"> </w:t>
-      </w:r>
-      <w:r>
-        <w:rPr>
-          <w:rStyle w:val="VerbatimChar"/>
-        </w:rPr>
-        <w:t xml:space="preserve">diagnostics</w:t>
-      </w:r>
-      <w:r>
-        <w:t xml:space="preserve">: lectura → validación</w:t>
-      </w:r>
-      <w:r>
-        <w:t xml:space="preserve"> </w:t>
-      </w:r>
-      <w:r>
-        <w:t xml:space="preserve">por rango → conmutación independiente T/H →</w:t>
-      </w:r>
-      <w:r>
-        <w:t xml:space="preserve"> </w:t>
-      </w:r>
-      <w:r>
-        <w:t xml:space="preserve">promediado → severidad.</w:t>
+        <w:t xml:space="preserve">con una severidad escalonada que puede llegar a inhibir el ascensor.</w:t>
       </w:r>
     </w:p>
     <w:bookmarkStart w:id="32" w:name="sub:rango"/>
@@ -3087,7 +2998,15 @@
         <w:t xml:space="preserve"> </w:t>
       </w:r>
       <w:r>
-        <w:t xml:space="preserve">el rango total del chip (−40..80°C y 0..100</w:t>
+        <w:t xml:space="preserve">el rango total del chip (−40..80°C y 0..</w:t>
+      </w:r>
+      <m:oMath>
+        <m:r>
+          <m:t>100</m:t>
+        </m:r>
+      </m:oMath>
+      <w:r>
+        <w:t xml:space="preserve"> % según</w:t>
       </w:r>
       <w:r>
         <w:t xml:space="preserve"> </w:t>

</xml_diff>